<commit_message>
Editorial figure/table selection: Figures 1-2 main, Table 2 -> S6, Figure 3 -> S1
- Main article: Table 1, Figure 1 and Figure 2 (Kitagawa). The Kitagawa table
  moves unchanged (values and legend) to Supplementary Table S6; Results cite
  Figure 2 and S6 for exact values. Figure 2 legend added.
- Ages 5-34 figure becomes Supplementary Figure S1 (file renamed
  figS1_age_5_34_mortality.jpg), cited in the 5-34 Results and embedded in the
  supplement .docx.
- Figure 2 labels and S1 axis/legend use en dashes (2014–2021, 5–34).
- Title page counts: 1 table, 2 figures; 6 supplementary tables, 1 supplementary figure.
- Review copy renumbered (Figure 1, Figure 2, Supplementary Figure S1).
- Audit: 422/422 table numbers identical to source fragments; 0 equation objects;
  main text 2966 words, abstract 228. No series, model or interpretation changed.

Co-Authored-By: Claude Opus 5.5 <noreply@anthropic.com>
Claude-Session: https://claude.ai/code/session_01Jjc2YuT424wLt15p5tkiYG
</commit_message>
<xml_diff>
--- a/reanalysis/manuscript/article/build/manuscript.docx
+++ b/reanalysis/manuscript/article/build/manuscript.docx
@@ -546,7 +546,7 @@
         <w:pStyle w:val="FirstParagraph"/>
       </w:pPr>
       <w:r>
-        <w:t xml:space="preserve">Using the same completed-age population of 7 years and older for both calculations, the crude rate increased from 1.123 to 1.258 per 100,000 between 2014 and 2021 (+12.0%), whereas the directly age-standardised rate decreased from 1.123 to 1.078 (−4.0%; Tables 1 and 2; Figure 1). The estimated slope of the age-standardised series over all eight years was 0.0002 per 100,000 per year (95% CI −0.0213 to 0.0217; p = 0.983). Thus, the analysis did not support an increasing national age-standardised trend, although the confidence interval did not establish equivalence to a zero trend.</w:t>
+        <w:t xml:space="preserve">Using the same completed-age population of 7 years and older for both calculations, the crude rate increased from 1.123 to 1.258 per 100,000 between 2014 and 2021 (+12.0%), whereas the directly age-standardised rate decreased from 1.123 to 1.078 (−4.0%; Table 1; Figure 1; Supplementary Table S6). The estimated slope of the age-standardised series over all eight years was 0.0002 per 100,000 per year (95% CI −0.0213 to 0.0217; p = 0.983). Thus, the analysis did not support an increasing national age-standardised trend, although the confidence interval did not establish equivalence to a zero trend.</w:t>
       </w:r>
     </w:p>
     <w:p>
@@ -572,7 +572,7 @@
         <w:pStyle w:val="FirstParagraph"/>
       </w:pPr>
       <w:r>
-        <w:t xml:space="preserve">The age-composition component accounted for 62% to 193% of the observed crude-rate increase across the six endpoint comparisons, while the component associated with age-specific mortality rates changed sign (Table 2). For 2014–2021, the positive composition effect (+0.191 per 100,000) exceeded the net increase (+0.135) and was partly offset by changes in age-specific rates (−0.057). Approximately 95% of the composition component arose among individuals aged 60 years or older.</w:t>
+        <w:t xml:space="preserve">The age-composition component accounted for 62% to 193% of the observed crude-rate increase across the six endpoint comparisons, while the component associated with age-specific mortality rates changed sign (Figure 2; exact values in Supplementary Table S6). For 2014–2021, the positive composition effect (+0.191 per 100,000) exceeded the net increase (+0.135) and was partly offset by changes in age-specific rates (−0.057). Approximately 95% of the composition component arose among individuals aged 60 years or older.</w:t>
       </w:r>
     </w:p>
     <w:bookmarkEnd w:id="33"/>
@@ -590,7 +590,7 @@
         <w:pStyle w:val="FirstParagraph"/>
       </w:pPr>
       <w:r>
-        <w:t xml:space="preserve">The rate at ages 5–34 years rose from 0.182 to 0.219 per 100,000 between 2014 and 2021 (+20.3%; slope 0.0080 per year, 95% CI 0.0023 to 0.0138; p = 0.014; Table 1). The group had 1,591 deaths over the period, between 172 and 236 per year, with the lowest rate in 2017 (0.175) and the highest in 2020 (0.244). The control group aged 7–34 years gave a similar result (+23.5%; p = 0.011); it contains nearly all the deaths of the 5–34 group, so it shows that the estimate does not depend on ages 5 and 6 rather than replicating it independently.</w:t>
+        <w:t xml:space="preserve">The rate at ages 5–34 years rose from 0.182 to 0.219 per 100,000 between 2014 and 2021 (+20.3%; slope 0.0080 per year, 95% CI 0.0023 to 0.0138; p = 0.014; Table 1). The group had 1,591 deaths over the period, between 172 and 236 per year, with the lowest rate in 2017 (0.175) and the highest in 2020 (0.244) (Supplementary Figure S1). The control group aged 7–34 years gave a similar result (+23.5%; p = 0.011; Supplementary Figure S1); it contains nearly all the deaths of the 5–34 group, so it shows that the estimate does not depend on ages 5 and 6 rather than replicating it independently.</w:t>
       </w:r>
     </w:p>
     <w:p>
@@ -1577,674 +1577,14 @@
         </w:tc>
       </w:tr>
     </w:tbl>
-    <w:p/>
-    <w:p>
-      <w:pPr>
-        <w:pStyle w:val="TableCaption"/>
-      </w:pPr>
-      <w:r>
-        <w:rPr>
-          <w:bCs/>
-          <w:b/>
-        </w:rPr>
-        <w:t xml:space="preserve">Table 2.</w:t>
-      </w:r>
-      <w:r>
-        <w:t xml:space="preserve"> </w:t>
-      </w:r>
-      <w:r>
-        <w:t xml:space="preserve">Kitagawa decomposition of the change in the crude rate, completed ages 7 years and older (post hoc analysis). Rates and components per 100,000; population from the IBGE 2018 projection. The two components sum to the change in the crude rate.</w:t>
-      </w:r>
-      <w:r>
-        <w:t xml:space="preserve"> </w:t>
-      </w:r>
-      <w:r>
-        <w:rPr>
-          <w:vertAlign w:val="superscript"/>
-        </w:rPr>
-        <w:t xml:space="preserve">a</w:t>
-      </w:r>
-      <w:r>
-        <w:t xml:space="preserve">Age-composition component as a percentage of the change in the crude rate; it exceeds 100% when the age-specific-rate component is negative, that is, when changes in age-specific rates partly offset the effect of the changing age composition.</w:t>
-      </w:r>
-    </w:p>
-    <w:tbl>
-      <w:tblPr>
-        <w:tblStyle w:val="Table"/>
-        <w:tblW w:type="pct" w:w="5000"/>
-        <w:tblLook w:firstRow="1" w:lastRow="0" w:firstColumn="0" w:lastColumn="0" w:noHBand="0" w:noVBand="0" w:val="0020"/>
-        <w:jc w:val="start"/>
-        <w:tblCaption w:val="Table 2. Kitagawa decomposition of the change in the crude rate, completed ages 7 years and older (post hoc analysis). Rates and components per 100,000; population from the IBGE 2018 projection. The two components sum to the change in the crude rate. aAge-composition component as a percentage of the change in the crude rate; it exceeds 100% when the age-specific-rate component is negative, that is, when changes in age-specific rates partly offset the effect of the changing age composition."/>
-      </w:tblPr>
-      <w:tblGrid>
-        <w:gridCol w:w="1000"/>
-        <w:gridCol w:w="1000"/>
-        <w:gridCol w:w="833"/>
-        <w:gridCol w:w="1250"/>
-        <w:gridCol w:w="1333"/>
-        <w:gridCol w:w="1250"/>
-        <w:gridCol w:w="1250"/>
-      </w:tblGrid>
-      <w:tr>
-        <w:trPr>
-          <w:tblHeader w:val="true"/>
-        </w:trPr>
-        <w:tc>
-          <w:tcPr/>
-          <w:p>
-            <w:pPr>
-              <w:pStyle w:val="Compact"/>
-              <w:jc w:val="left"/>
-            </w:pPr>
-            <w:r>
-              <w:t xml:space="preserve">Years compared</w:t>
-            </w:r>
-          </w:p>
-        </w:tc>
-        <w:tc>
-          <w:tcPr/>
-          <w:p>
-            <w:pPr>
-              <w:pStyle w:val="Compact"/>
-              <w:jc w:val="right"/>
-            </w:pPr>
-            <w:r>
-              <w:t xml:space="preserve">Crude rate, start / end</w:t>
-            </w:r>
-          </w:p>
-        </w:tc>
-        <w:tc>
-          <w:tcPr/>
-          <w:p>
-            <w:pPr>
-              <w:pStyle w:val="Compact"/>
-              <w:jc w:val="right"/>
-            </w:pPr>
-            <w:r>
-              <w:t xml:space="preserve">Change</w:t>
-            </w:r>
-          </w:p>
-        </w:tc>
-        <w:tc>
-          <w:tcPr/>
-          <w:p>
-            <w:pPr>
-              <w:pStyle w:val="Compact"/>
-              <w:jc w:val="right"/>
-            </w:pPr>
-            <w:r>
-              <w:t xml:space="preserve">Age composition</w:t>
-            </w:r>
-          </w:p>
-        </w:tc>
-        <w:tc>
-          <w:tcPr/>
-          <w:p>
-            <w:pPr>
-              <w:pStyle w:val="Compact"/>
-              <w:jc w:val="right"/>
-            </w:pPr>
-            <w:r>
-              <w:t xml:space="preserve">Age-specific rates</w:t>
-            </w:r>
-          </w:p>
-        </w:tc>
-        <w:tc>
-          <w:tcPr/>
-          <w:p>
-            <w:pPr>
-              <w:pStyle w:val="Compact"/>
-              <w:jc w:val="right"/>
-            </w:pPr>
-            <w:r>
-              <w:t xml:space="preserve">Composition share (%)</w:t>
-            </w:r>
-            <w:r>
-              <w:rPr>
-                <w:vertAlign w:val="superscript"/>
-              </w:rPr>
-              <w:t xml:space="preserve">a</w:t>
-            </w:r>
-          </w:p>
-        </w:tc>
-        <w:tc>
-          <w:tcPr/>
-          <w:p>
-            <w:pPr>
-              <w:pStyle w:val="Compact"/>
-              <w:jc w:val="right"/>
-            </w:pPr>
-            <w:r>
-              <w:t xml:space="preserve">Ages ≥60 in composition (%)</w:t>
-            </w:r>
-          </w:p>
-        </w:tc>
-      </w:tr>
-      <w:tr>
-        <w:tc>
-          <w:tcPr/>
-          <w:p>
-            <w:pPr>
-              <w:pStyle w:val="Compact"/>
-              <w:jc w:val="left"/>
-            </w:pPr>
-            <w:r>
-              <w:t xml:space="preserve">2014–2021</w:t>
-            </w:r>
-          </w:p>
-        </w:tc>
-        <w:tc>
-          <w:tcPr/>
-          <w:p>
-            <w:pPr>
-              <w:pStyle w:val="Compact"/>
-              <w:jc w:val="right"/>
-            </w:pPr>
-            <w:r>
-              <w:t xml:space="preserve">1.123 / 1.258</w:t>
-            </w:r>
-          </w:p>
-        </w:tc>
-        <w:tc>
-          <w:tcPr/>
-          <w:p>
-            <w:pPr>
-              <w:pStyle w:val="Compact"/>
-              <w:jc w:val="right"/>
-            </w:pPr>
-            <w:r>
-              <w:t xml:space="preserve">+0.135</w:t>
-            </w:r>
-          </w:p>
-        </w:tc>
-        <w:tc>
-          <w:tcPr/>
-          <w:p>
-            <w:pPr>
-              <w:pStyle w:val="Compact"/>
-              <w:jc w:val="right"/>
-            </w:pPr>
-            <w:r>
-              <w:t xml:space="preserve">+0.191</w:t>
-            </w:r>
-          </w:p>
-        </w:tc>
-        <w:tc>
-          <w:tcPr/>
-          <w:p>
-            <w:pPr>
-              <w:pStyle w:val="Compact"/>
-              <w:jc w:val="right"/>
-            </w:pPr>
-            <w:r>
-              <w:t xml:space="preserve">−0.057</w:t>
-            </w:r>
-          </w:p>
-        </w:tc>
-        <w:tc>
-          <w:tcPr/>
-          <w:p>
-            <w:pPr>
-              <w:pStyle w:val="Compact"/>
-              <w:jc w:val="right"/>
-            </w:pPr>
-            <w:r>
-              <w:t xml:space="preserve">142</w:t>
-            </w:r>
-          </w:p>
-        </w:tc>
-        <w:tc>
-          <w:tcPr/>
-          <w:p>
-            <w:pPr>
-              <w:pStyle w:val="Compact"/>
-              <w:jc w:val="right"/>
-            </w:pPr>
-            <w:r>
-              <w:t xml:space="preserve">95</w:t>
-            </w:r>
-          </w:p>
-        </w:tc>
-      </w:tr>
-      <w:tr>
-        <w:tc>
-          <w:tcPr/>
-          <w:p>
-            <w:pPr>
-              <w:pStyle w:val="Compact"/>
-              <w:jc w:val="left"/>
-            </w:pPr>
-            <w:r>
-              <w:t xml:space="preserve">2014–2019</w:t>
-            </w:r>
-          </w:p>
-        </w:tc>
-        <w:tc>
-          <w:tcPr/>
-          <w:p>
-            <w:pPr>
-              <w:pStyle w:val="Compact"/>
-              <w:jc w:val="right"/>
-            </w:pPr>
-            <w:r>
-              <w:t xml:space="preserve">1.123 / 1.276</w:t>
-            </w:r>
-          </w:p>
-        </w:tc>
-        <w:tc>
-          <w:tcPr/>
-          <w:p>
-            <w:pPr>
-              <w:pStyle w:val="Compact"/>
-              <w:jc w:val="right"/>
-            </w:pPr>
-            <w:r>
-              <w:t xml:space="preserve">+0.154</w:t>
-            </w:r>
-          </w:p>
-        </w:tc>
-        <w:tc>
-          <w:tcPr/>
-          <w:p>
-            <w:pPr>
-              <w:pStyle w:val="Compact"/>
-              <w:jc w:val="right"/>
-            </w:pPr>
-            <w:r>
-              <w:t xml:space="preserve">+0.138</w:t>
-            </w:r>
-          </w:p>
-        </w:tc>
-        <w:tc>
-          <w:tcPr/>
-          <w:p>
-            <w:pPr>
-              <w:pStyle w:val="Compact"/>
-              <w:jc w:val="right"/>
-            </w:pPr>
-            <w:r>
-              <w:t xml:space="preserve">+0.016</w:t>
-            </w:r>
-          </w:p>
-        </w:tc>
-        <w:tc>
-          <w:tcPr/>
-          <w:p>
-            <w:pPr>
-              <w:pStyle w:val="Compact"/>
-              <w:jc w:val="right"/>
-            </w:pPr>
-            <w:r>
-              <w:t xml:space="preserve">90</w:t>
-            </w:r>
-          </w:p>
-        </w:tc>
-        <w:tc>
-          <w:tcPr/>
-          <w:p>
-            <w:pPr>
-              <w:pStyle w:val="Compact"/>
-              <w:jc w:val="right"/>
-            </w:pPr>
-            <w:r>
-              <w:t xml:space="preserve">95</w:t>
-            </w:r>
-          </w:p>
-        </w:tc>
-      </w:tr>
-      <w:tr>
-        <w:tc>
-          <w:tcPr/>
-          <w:p>
-            <w:pPr>
-              <w:pStyle w:val="Compact"/>
-              <w:jc w:val="left"/>
-            </w:pPr>
-            <w:r>
-              <w:t xml:space="preserve">2014–2020</w:t>
-            </w:r>
-          </w:p>
-        </w:tc>
-        <w:tc>
-          <w:tcPr/>
-          <w:p>
-            <w:pPr>
-              <w:pStyle w:val="Compact"/>
-              <w:jc w:val="right"/>
-            </w:pPr>
-            <w:r>
-              <w:t xml:space="preserve">1.123 / 1.401</w:t>
-            </w:r>
-          </w:p>
-        </w:tc>
-        <w:tc>
-          <w:tcPr/>
-          <w:p>
-            <w:pPr>
-              <w:pStyle w:val="Compact"/>
-              <w:jc w:val="right"/>
-            </w:pPr>
-            <w:r>
-              <w:t xml:space="preserve">+0.278</w:t>
-            </w:r>
-          </w:p>
-        </w:tc>
-        <w:tc>
-          <w:tcPr/>
-          <w:p>
-            <w:pPr>
-              <w:pStyle w:val="Compact"/>
-              <w:jc w:val="right"/>
-            </w:pPr>
-            <w:r>
-              <w:t xml:space="preserve">+0.171</w:t>
-            </w:r>
-          </w:p>
-        </w:tc>
-        <w:tc>
-          <w:tcPr/>
-          <w:p>
-            <w:pPr>
-              <w:pStyle w:val="Compact"/>
-              <w:jc w:val="right"/>
-            </w:pPr>
-            <w:r>
-              <w:t xml:space="preserve">+0.107</w:t>
-            </w:r>
-          </w:p>
-        </w:tc>
-        <w:tc>
-          <w:tcPr/>
-          <w:p>
-            <w:pPr>
-              <w:pStyle w:val="Compact"/>
-              <w:jc w:val="right"/>
-            </w:pPr>
-            <w:r>
-              <w:t xml:space="preserve">62</w:t>
-            </w:r>
-          </w:p>
-        </w:tc>
-        <w:tc>
-          <w:tcPr/>
-          <w:p>
-            <w:pPr>
-              <w:pStyle w:val="Compact"/>
-              <w:jc w:val="right"/>
-            </w:pPr>
-            <w:r>
-              <w:t xml:space="preserve">94</w:t>
-            </w:r>
-          </w:p>
-        </w:tc>
-      </w:tr>
-      <w:tr>
-        <w:tc>
-          <w:tcPr/>
-          <w:p>
-            <w:pPr>
-              <w:pStyle w:val="Compact"/>
-              <w:jc w:val="left"/>
-            </w:pPr>
-            <w:r>
-              <w:t xml:space="preserve">2015–2021</w:t>
-            </w:r>
-          </w:p>
-        </w:tc>
-        <w:tc>
-          <w:tcPr/>
-          <w:p>
-            <w:pPr>
-              <w:pStyle w:val="Compact"/>
-              <w:jc w:val="right"/>
-            </w:pPr>
-            <w:r>
-              <w:t xml:space="preserve">1.171 / 1.258</w:t>
-            </w:r>
-          </w:p>
-        </w:tc>
-        <w:tc>
-          <w:tcPr/>
-          <w:p>
-            <w:pPr>
-              <w:pStyle w:val="Compact"/>
-              <w:jc w:val="right"/>
-            </w:pPr>
-            <w:r>
-              <w:t xml:space="preserve">+0.087</w:t>
-            </w:r>
-          </w:p>
-        </w:tc>
-        <w:tc>
-          <w:tcPr/>
-          <w:p>
-            <w:pPr>
-              <w:pStyle w:val="Compact"/>
-              <w:jc w:val="right"/>
-            </w:pPr>
-            <w:r>
-              <w:t xml:space="preserve">+0.167</w:t>
-            </w:r>
-          </w:p>
-        </w:tc>
-        <w:tc>
-          <w:tcPr/>
-          <w:p>
-            <w:pPr>
-              <w:pStyle w:val="Compact"/>
-              <w:jc w:val="right"/>
-            </w:pPr>
-            <w:r>
-              <w:t xml:space="preserve">−0.081</w:t>
-            </w:r>
-          </w:p>
-        </w:tc>
-        <w:tc>
-          <w:tcPr/>
-          <w:p>
-            <w:pPr>
-              <w:pStyle w:val="Compact"/>
-              <w:jc w:val="right"/>
-            </w:pPr>
-            <w:r>
-              <w:t xml:space="preserve">193</w:t>
-            </w:r>
-          </w:p>
-        </w:tc>
-        <w:tc>
-          <w:tcPr/>
-          <w:p>
-            <w:pPr>
-              <w:pStyle w:val="Compact"/>
-              <w:jc w:val="right"/>
-            </w:pPr>
-            <w:r>
-              <w:t xml:space="preserve">95</w:t>
-            </w:r>
-          </w:p>
-        </w:tc>
-      </w:tr>
-      <w:tr>
-        <w:tc>
-          <w:tcPr/>
-          <w:p>
-            <w:pPr>
-              <w:pStyle w:val="Compact"/>
-              <w:jc w:val="left"/>
-            </w:pPr>
-            <w:r>
-              <w:t xml:space="preserve">2016–2021</w:t>
-            </w:r>
-          </w:p>
-        </w:tc>
-        <w:tc>
-          <w:tcPr/>
-          <w:p>
-            <w:pPr>
-              <w:pStyle w:val="Compact"/>
-              <w:jc w:val="right"/>
-            </w:pPr>
-            <w:r>
-              <w:t xml:space="preserve">1.184 / 1.258</w:t>
-            </w:r>
-          </w:p>
-        </w:tc>
-        <w:tc>
-          <w:tcPr/>
-          <w:p>
-            <w:pPr>
-              <w:pStyle w:val="Compact"/>
-              <w:jc w:val="right"/>
-            </w:pPr>
-            <w:r>
-              <w:t xml:space="preserve">+0.073</w:t>
-            </w:r>
-          </w:p>
-        </w:tc>
-        <w:tc>
-          <w:tcPr/>
-          <w:p>
-            <w:pPr>
-              <w:pStyle w:val="Compact"/>
-              <w:jc w:val="right"/>
-            </w:pPr>
-            <w:r>
-              <w:t xml:space="preserve">+0.140</w:t>
-            </w:r>
-          </w:p>
-        </w:tc>
-        <w:tc>
-          <w:tcPr/>
-          <w:p>
-            <w:pPr>
-              <w:pStyle w:val="Compact"/>
-              <w:jc w:val="right"/>
-            </w:pPr>
-            <w:r>
-              <w:t xml:space="preserve">−0.067</w:t>
-            </w:r>
-          </w:p>
-        </w:tc>
-        <w:tc>
-          <w:tcPr/>
-          <w:p>
-            <w:pPr>
-              <w:pStyle w:val="Compact"/>
-              <w:jc w:val="right"/>
-            </w:pPr>
-            <w:r>
-              <w:t xml:space="preserve">191</w:t>
-            </w:r>
-          </w:p>
-        </w:tc>
-        <w:tc>
-          <w:tcPr/>
-          <w:p>
-            <w:pPr>
-              <w:pStyle w:val="Compact"/>
-              <w:jc w:val="right"/>
-            </w:pPr>
-            <w:r>
-              <w:t xml:space="preserve">95</w:t>
-            </w:r>
-          </w:p>
-        </w:tc>
-      </w:tr>
-      <w:tr>
-        <w:tc>
-          <w:tcPr/>
-          <w:p>
-            <w:pPr>
-              <w:pStyle w:val="Compact"/>
-              <w:jc w:val="left"/>
-            </w:pPr>
-            <w:r>
-              <w:t xml:space="preserve">2014–2018</w:t>
-            </w:r>
-          </w:p>
-        </w:tc>
-        <w:tc>
-          <w:tcPr/>
-          <w:p>
-            <w:pPr>
-              <w:pStyle w:val="Compact"/>
-              <w:jc w:val="right"/>
-            </w:pPr>
-            <w:r>
-              <w:t xml:space="preserve">1.123 / 1.194</w:t>
-            </w:r>
-          </w:p>
-        </w:tc>
-        <w:tc>
-          <w:tcPr/>
-          <w:p>
-            <w:pPr>
-              <w:pStyle w:val="Compact"/>
-              <w:jc w:val="right"/>
-            </w:pPr>
-            <w:r>
-              <w:t xml:space="preserve">+0.071</w:t>
-            </w:r>
-          </w:p>
-        </w:tc>
-        <w:tc>
-          <w:tcPr/>
-          <w:p>
-            <w:pPr>
-              <w:pStyle w:val="Compact"/>
-              <w:jc w:val="right"/>
-            </w:pPr>
-            <w:r>
-              <w:t xml:space="preserve">+0.107</w:t>
-            </w:r>
-          </w:p>
-        </w:tc>
-        <w:tc>
-          <w:tcPr/>
-          <w:p>
-            <w:pPr>
-              <w:pStyle w:val="Compact"/>
-              <w:jc w:val="right"/>
-            </w:pPr>
-            <w:r>
-              <w:t xml:space="preserve">−0.036</w:t>
-            </w:r>
-          </w:p>
-        </w:tc>
-        <w:tc>
-          <w:tcPr/>
-          <w:p>
-            <w:pPr>
-              <w:pStyle w:val="Compact"/>
-              <w:jc w:val="right"/>
-            </w:pPr>
-            <w:r>
-              <w:t xml:space="preserve">151</w:t>
-            </w:r>
-          </w:p>
-        </w:tc>
-        <w:tc>
-          <w:tcPr/>
-          <w:p>
-            <w:pPr>
-              <w:pStyle w:val="Compact"/>
-              <w:jc w:val="right"/>
-            </w:pPr>
-            <w:r>
-              <w:t xml:space="preserve">94</w:t>
-            </w:r>
-          </w:p>
-        </w:tc>
-      </w:tr>
-    </w:tbl>
     <w:bookmarkEnd w:id="42"/>
-    <w:bookmarkStart w:id="43" w:name="figure-legend"/>
+    <w:bookmarkStart w:id="43" w:name="figure-legends"/>
     <w:p>
       <w:pPr>
         <w:pStyle w:val="Heading1"/>
       </w:pPr>
       <w:r>
-        <w:t xml:space="preserve">Figure legend</w:t>
+        <w:t xml:space="preserve">Figure legends</w:t>
       </w:r>
     </w:p>
     <w:p>
@@ -2263,6 +1603,24 @@
       </w:r>
       <w:r>
         <w:t xml:space="preserve">Relative change in each rate from its 2014 value, Brazil, 2014–2021: crude rate (dashed line, open circles) and age-standardised rate (Brazil 2014 standard; solid line, filled circles), both for completed ages of 7 years and older and the same deaths and population, and rate at ages 5–34 years (dash-dot line, triangles). Annual data; population from the IBGE 2018 projection. File: fig1_relative_change_ge7.jpg.</w:t>
+      </w:r>
+    </w:p>
+    <w:p>
+      <w:pPr>
+        <w:pStyle w:val="BodyText"/>
+      </w:pPr>
+      <w:r>
+        <w:rPr>
+          <w:bCs/>
+          <w:b/>
+        </w:rPr>
+        <w:t xml:space="preserve">Figure 2.</w:t>
+      </w:r>
+      <w:r>
+        <w:t xml:space="preserve"> </w:t>
+      </w:r>
+      <w:r>
+        <w:t xml:space="preserve">Kitagawa decomposition of the change in the crude rate, completed ages 7 years and older, for six pairs of years (post hoc analysis), Brazil. Black bars: age-composition component; hatched bars: age-specific-rate component. The two components sum to the change in the crude rate. Deaths per 100,000; population from the IBGE 2018 projection. Exact values in Supplementary Table S6. File: fig2_kitagawa_sensitivity.jpg.</w:t>
       </w:r>
     </w:p>
     <w:bookmarkEnd w:id="43"/>

</xml_diff>

<commit_message>
Apply editorial review: S6 first cited in Kitagawa section; Discussion and Introduction wording
- Remove the early citation of Supplementary Table S6 from the age-standardised
  trend paragraph; first citations now run S1-S6, then Supplementary Figure S1.
- Discussion: P1 "not statistically distinguishable from zero"; P2 two
  sentences on distinguishing counts/crude rates from age-adjusted trends and on
  Brum's statement; P4 confidence intervals do not rule out increases of
  comparable magnitude under some specifications; P6 "annual national crude rates".
- Introduction: the 2.5% figure is no longer attributed to crude-rate modelling.
- Rebuilt .docx: main text 2994 words (limit 3000), abstract 228 words.
No numbers, tables, figures or analyses changed.

Co-Authored-By: Claude Opus 5.5 <noreply@anthropic.com>
Claude-Session: https://claude.ai/code/session_01Jjc2YuT424wLt15p5tkiYG
</commit_message>
<xml_diff>
--- a/reanalysis/manuscript/article/build/manuscript.docx
+++ b/reanalysis/manuscript/article/build/manuscript.docx
@@ -220,7 +220,7 @@
         <w:t xml:space="preserve"> </w:t>
       </w:r>
       <w:r>
-        <w:t xml:space="preserve">[1]. Their nationwide analysis for 2014–2021 identified 18,584 asthma deaths and reported an annual increase of approximately 2.5% based on national crude mortality rates. A subsequent study by Cardoso et al., covering 2013–2023, also concluded that asthma-related deaths had increased [2]. However, this conclusion was based on annual death counts, while the same study reported that the overall mortality rate per 100,000 inhabitants remained stable. Thus, the two studies described increasing asthma mortality using different measures, neither of which established an increase in the national age-standardised rate.</w:t>
+        <w:t xml:space="preserve">[1]. Their nationwide analysis for 2014–2021 identified 18,584 asthma deaths and reported an approximately 2.5% annual increase in asthma mortality. A subsequent study by Cardoso et al., covering 2013–2023, also concluded that asthma-related deaths had increased [2]. However, this conclusion was based on annual death counts, while the same study reported that the overall mortality rate per 100,000 inhabitants remained stable. Thus, the two studies described increasing asthma mortality using different measures, neither of which established an increase in the national age-standardised rate.</w:t>
       </w:r>
     </w:p>
     <w:p>
@@ -546,7 +546,7 @@
         <w:pStyle w:val="FirstParagraph"/>
       </w:pPr>
       <w:r>
-        <w:t xml:space="preserve">Using the same completed-age population of 7 years and older for both calculations, the crude rate increased from 1.123 to 1.258 per 100,000 between 2014 and 2021 (+12.0%), whereas the directly age-standardised rate decreased from 1.123 to 1.078 (−4.0%; Table 1; Figure 1; Supplementary Table S6). The estimated slope of the age-standardised series over all eight years was 0.0002 per 100,000 per year (95% CI −0.0213 to 0.0217; p = 0.983). Thus, the analysis did not support an increasing national age-standardised trend, although the confidence interval did not establish equivalence to a zero trend.</w:t>
+        <w:t xml:space="preserve">Using the same completed-age population of 7 years and older for both calculations, the crude rate increased from 1.123 to 1.258 per 100,000 between 2014 and 2021 (+12.0%), whereas the directly age-standardised rate decreased from 1.123 to 1.078 (−4.0%; Table 1; Figure 1). The estimated slope of the age-standardised series over all eight years was 0.0002 per 100,000 per year (95% CI −0.0213 to 0.0217; p = 0.983). Thus, the analysis did not support an increasing national age-standardised trend, although the confidence interval did not establish equivalence to a zero trend.</w:t>
       </w:r>
     </w:p>
     <w:p>
@@ -625,7 +625,7 @@
         <w:pStyle w:val="FirstParagraph"/>
       </w:pPr>
       <w:r>
-        <w:t xml:space="preserve">We reproduced the crude increase in asthma mortality reported by Brum et al. for 2014–2021, with one death of difference in the total count and the same direction of the national and age-group trends. After direct age standardisation, however, the national trend was no longer positive: the standardised rate fell by 4.0% and its slope over the eight years was close to zero, with a confidence interval that admits small changes in either direction. In a decomposition of the crude change, shifts in the age composition of the population accounted for most of the increase, and in the 2014–2021 comparison for more than all of it. The rise in mortality at 5–34 years, by contrast, persisted across every specification we examined.</w:t>
+        <w:t xml:space="preserve">We reproduced the crude increase in asthma mortality reported by Brum et al. for 2014–2021, with one death of difference in the total count and the same direction of the national and age-group trends. After direct age standardisation, however, the national age-standardised trend was not statistically distinguishable from zero: the standardised rate fell by 4.0% and its slope over the eight years was close to zero, with a confidence interval that admits small changes in either direction. In a decomposition of the crude change, shifts in the age composition of the population accounted for most of the increase, and in the 2014–2021 comparison for more than all of it. The rise in mortality at 5–34 years, by contrast, persisted across every specification we examined.</w:t>
       </w:r>
     </w:p>
     <w:p>
@@ -633,7 +633,7 @@
         <w:pStyle w:val="BodyText"/>
       </w:pPr>
       <w:r>
-        <w:t xml:space="preserve">These results do not contradict the crude series of Brum et al.; they qualify its interpretation. A rising crude rate measures a rising burden of deaths in the population, which is relevant for health services. It does not by itself show that the risk of dying from asthma at a given age has increased. Cardoso et al. reported an increase in the number of asthma deaths over 2013–2023 while noting that the overall rate per 100,000 inhabitants remained stable [2]. Read together with our standardised series, the three analyses describe a growing number of deaths in an ageing population rather than a general increase in age-specific mortality. The statement that asthma mortality</w:t>
+        <w:t xml:space="preserve">These results do not contradict the crude series of Brum et al.; they qualify its interpretation. A rising crude rate measures a rising burden of deaths in the population, which is relevant for health services. It does not by itself show that the risk of dying from asthma at a given age has increased. Cardoso et al. reported an increase in the number of asthma deaths over 2013–2023 while noting that the overall rate per 100,000 inhabitants remained stable [2]. Together, these studies illustrate why trends in death counts and crude rates should be distinguished from age-adjusted trends. In our reanalysis, changes in population age composition accounted for much of the crude increase. The statement that asthma mortality</w:t>
       </w:r>
       <w:r>
         <w:t xml:space="preserve"> </w:t>
@@ -651,7 +651,7 @@
         <w:t xml:space="preserve"> </w:t>
       </w:r>
       <w:r>
-        <w:t xml:space="preserve">[1] therefore holds for the crude rate but is not supported for the age-adjusted rate in this period.</w:t>
+        <w:t xml:space="preserve">[1] is consistent with the crude-rate increase reported by Brum et al., but our analysis does not establish a comparable increase in national age-standardised mortality during 2014–2021.</w:t>
       </w:r>
     </w:p>
     <w:p>
@@ -667,7 +667,7 @@
         <w:pStyle w:val="BodyText"/>
       </w:pPr>
       <w:r>
-        <w:t xml:space="preserve">The national age-adjusted result was not uniform across specifications. One of six count-model specifications, the negative binomial model with the 2024 population projection, estimated an increase of 1.1% per year whose interval excluded zero. The remaining specifications gave estimates between 0% and 0.9% per year with intervals that included zero. With eight annual observations, these data cannot establish that age-adjusted mortality was constant; they show that any change was small compared with the crude increase.</w:t>
+        <w:t xml:space="preserve">The national age-adjusted result was not uniform across specifications. One of six count-model specifications, the negative binomial model with the 2024 population projection, estimated an increase of 1.1% per year whose interval excluded zero. The remaining specifications gave estimates between 0% and 0.9% per year with intervals that included zero. With eight annual observations, these data cannot establish that age-adjusted mortality was constant; the age-adjusted point estimates were generally smaller than the crude estimate, although the confidence intervals did not rule out increases of comparable magnitude under some specifications.</w:t>
       </w:r>
     </w:p>
     <w:p>
@@ -683,7 +683,7 @@
         <w:pStyle w:val="BodyText"/>
       </w:pPr>
       <w:r>
-        <w:t xml:space="preserve">The reproduction also shows the limits of what published estimates allow. Our population denominators differed from those of the original study, so our rates were 1.8% to 5.4% lower, and the magnitude of the change at 60 years or older could not be reconciled. The original code made it possible to identify these differences, but the exact population series could not be recovered. Reporting the denominators used, together with age-standardised rates alongside crude rates, would make national asthma surveillance comparable across studies and years.</w:t>
+        <w:t xml:space="preserve">The reproduction also shows the limits of what published estimates allow. Our population denominators differed from those of the original study, so our annual national crude rates were 1.8% to 5.4% lower, and the magnitude of the change at 60 years or older could not be reconciled. The original code made it possible to identify these differences, but the exact population series could not be recovered. Reporting the denominators used, together with age-standardised rates alongside crude rates, would make national asthma surveillance comparable across studies and years.</w:t>
       </w:r>
     </w:p>
     <w:p>

</xml_diff>

<commit_message>
Regenerate Word files from the author-roles and AI-oversight sources
Rebuilt with build_docx.sh and build_review_figures.py. Audit: 7 tables with all
numbers identical to the source fragments, 0 equation objects, Supplementary
Figure S1 embedded, corresponding author present on the title page.
WARNING (BUILD_REPORT.txt): main text is now 3075 words, above the RRCP limit of
3000, because the assigned-oversight paragraph sits in Methods. Not for merge
until resolved.

Co-Authored-By: Claude Opus 5.5 <noreply@anthropic.com>
Claude-Session: https://claude.ai/code/session_01Jjc2YuT424wLt15p5tkiYG
</commit_message>
<xml_diff>
--- a/reanalysis/manuscript/article/build/manuscript.docx
+++ b/reanalysis/manuscript/article/build/manuscript.docx
@@ -450,7 +450,17 @@
         <w:pStyle w:val="BodyText"/>
       </w:pPr>
       <w:r>
-        <w:t xml:space="preserve">[AUTHOR CONFIRMATION REQUIRED: Describe the actual human review and validation performed on the code and outputs, and confirm the authors’ responsibility for the analytical decisions.]</w:t>
+        <w:rPr>
+          <w:bCs/>
+          <w:b/>
+        </w:rPr>
+        <w:t xml:space="preserve">Assigned human oversight (pending completion and co-author confirmation).</w:t>
+      </w:r>
+      <w:r>
+        <w:t xml:space="preserve"> </w:t>
+      </w:r>
+      <w:r>
+        <w:t xml:space="preserve">Francisco Federico García Crespi (corresponding author) is responsible for checking the provenance of the public SIM/IBGE inputs, auditing code and outputs against the committed tables and figures, and approving the statistical analyses and final interpretations. Amaury de Souza is assigned independent scientific review of case selection, age standardisation, the Kitagawa accounting decomposition, the 5–34-year finding, robustness analyses, and the epidemiological interpretation and limitations. Both authors must inspect the relevant evidence and confirm that the reported results and disclosures accurately reflect their own review before submission. These assignments do not assert that review or validation has already been completed.</w:t>
       </w:r>
     </w:p>
     <w:p>
@@ -771,7 +781,17 @@
         <w:pStyle w:val="FirstParagraph"/>
       </w:pPr>
       <w:r>
-        <w:t xml:space="preserve">[AUTHOR INPUT REQUIRED]</w:t>
+        <w:rPr>
+          <w:bCs/>
+          <w:b/>
+        </w:rPr>
+        <w:t xml:space="preserve">Provisional CRediT assignments (subject to both authors’ approval):</w:t>
+      </w:r>
+      <w:r>
+        <w:t xml:space="preserve"> </w:t>
+      </w:r>
+      <w:r>
+        <w:t xml:space="preserve">Francisco Federico García Crespi — Conceptualization, Methodology, Software, Formal analysis, Data curation, Visualization, Writing – original draft, and Corresponding author. Amaury de Souza — Writing – review &amp; editing, Validation (epidemiological and scientific interpretation), and scientific review of the manuscript. Contributions are assignments for review, not confirmation that all listed tasks are complete. Final author order and any additional contributors require author confirmation.</w:t>
       </w:r>
     </w:p>
     <w:bookmarkEnd w:id="40"/>

</xml_diff>

<commit_message>
Move assigned-oversight paragraph to an author checklist; fix CRediT list
- The "Assigned human oversight" paragraph is moved verbatim from Methods to
  reanalysis/manuscript/article/AUTHOR_REVIEW_CHECKLIST.md (internal, not
  submitted), replaced by a short [AUTHOR CONFIRMATION REQUIRED] marker for the
  final one-sentence review statement.
- Checklist also lists the open items: postal address, official English
  department name (current wording unverified), affiliations, keywords, funding,
  conflicts, ethics criterion, AI acknowledgment, final CRediT roles.
- CRediT: remove "Corresponding author", which is not a CRediT role (it remains
  on the title page).
- Rebuilt .docx: main text 2982 words (limit 3000), abstract 228.

Co-Authored-By: Claude Opus 5.5 <noreply@anthropic.com>
Claude-Session: https://claude.ai/code/session_01Jjc2YuT424wLt15p5tkiYG
</commit_message>
<xml_diff>
--- a/reanalysis/manuscript/article/build/manuscript.docx
+++ b/reanalysis/manuscript/article/build/manuscript.docx
@@ -450,17 +450,7 @@
         <w:pStyle w:val="BodyText"/>
       </w:pPr>
       <w:r>
-        <w:rPr>
-          <w:bCs/>
-          <w:b/>
-        </w:rPr>
-        <w:t xml:space="preserve">Assigned human oversight (pending completion and co-author confirmation).</w:t>
-      </w:r>
-      <w:r>
-        <w:t xml:space="preserve"> </w:t>
-      </w:r>
-      <w:r>
-        <w:t xml:space="preserve">Francisco Federico García Crespi (corresponding author) is responsible for checking the provenance of the public SIM/IBGE inputs, auditing code and outputs against the committed tables and figures, and approving the statistical analyses and final interpretations. Amaury de Souza is assigned independent scientific review of case selection, age standardisation, the Kitagawa accounting decomposition, the 5–34-year finding, robustness analyses, and the epidemiological interpretation and limitations. Both authors must inspect the relevant evidence and confirm that the reported results and disclosures accurately reflect their own review before submission. These assignments do not assert that review or validation has already been completed.</w:t>
+        <w:t xml:space="preserve">[AUTHOR CONFIRMATION REQUIRED: one-sentence statement of the human review actually completed; see AUTHOR_REVIEW_CHECKLIST.md.]</w:t>
       </w:r>
     </w:p>
     <w:p>
@@ -791,7 +781,7 @@
         <w:t xml:space="preserve"> </w:t>
       </w:r>
       <w:r>
-        <w:t xml:space="preserve">Francisco Federico García Crespi — Conceptualization, Methodology, Software, Formal analysis, Data curation, Visualization, Writing – original draft, and Corresponding author. Amaury de Souza — Writing – review &amp; editing, Validation (epidemiological and scientific interpretation), and scientific review of the manuscript. Contributions are assignments for review, not confirmation that all listed tasks are complete. Final author order and any additional contributors require author confirmation.</w:t>
+        <w:t xml:space="preserve">Francisco Federico García Crespi — Conceptualization, Methodology, Software, Formal analysis, Data curation, Visualization, and Writing – original draft. Amaury de Souza — Writing – review &amp; editing, Validation (epidemiological and scientific interpretation), and scientific review of the manuscript. Contributions are assignments for review, not confirmation that all listed tasks are complete. Final author order and any additional contributors require author confirmation.</w:t>
       </w:r>
     </w:p>
     <w:bookmarkEnd w:id="40"/>

</xml_diff>

<commit_message>
Apply approved language edits from the author-review copy
Six wording changes in the Introduction and Discussion (the 5-34 sentence
reworded to avoid repeating "warrants"), one sentence added to the Figure 2
legend, and a provisional Acknowledgments statement on AI-assisted language
editing pending author validation. No numbers, citations, tables or figures
change. Main text: 2,966 words (RRCP limit 3,000); abstract unchanged (228).

Keywords stay pending; the MeSH check is recorded in the author checklist.
README marks the integrated Word copy (8a6d5a5) as a non-source reading copy.

Co-Authored-By: Claude Opus 5.5 <noreply@anthropic.com>
Claude-Session: https://claude.ai/code/session_01Jjc2YuT424wLt15p5tkiYG
</commit_message>
<xml_diff>
--- a/reanalysis/manuscript/article/build/manuscript.docx
+++ b/reanalysis/manuscript/article/build/manuscript.docx
@@ -228,7 +228,7 @@
         <w:pStyle w:val="BodyText"/>
       </w:pPr>
       <w:r>
-        <w:t xml:space="preserve">Historical evidence further illustrates the importance of distinguishing mortality measures and age groups. Graudenz et al. reported a linear decline in age-standardised asthma mortality among Brazilians aged 5–34 years during 1980–2014, whereas the trend in the general population was non-linear [3]. Differences in study periods, age ranges and rate definitions prevent direct comparison with more recent estimates or the identification of a historical trend reversal.</w:t>
+        <w:t xml:space="preserve">Earlier Brazilian surveillance provides a longer perspective. Graudenz et al. reported a linear decline in age-standardised asthma mortality among Brazilians aged 5–34 years during 1980–2014, whereas the trend in the general population was non-linear [3]. Differences in study periods, age ranges and rate definitions prevent direct comparison with more recent estimates or the identification of a historical trend reversal.</w:t>
       </w:r>
     </w:p>
     <w:p>
@@ -659,7 +659,7 @@
         <w:pStyle w:val="BodyText"/>
       </w:pPr>
       <w:r>
-        <w:t xml:space="preserve">The Kitagawa decomposition gives this reading a quantitative form, but it is an accounting decomposition, not a causal one. It splits a difference between two years into a component due to the age distribution and a component due to age-specific rates; it does not identify why either changed. Because two-year comparisons depend on their endpoints, we repeated it for six pairs of years. The composition component was positive in all of them, and about 95% of it arose at 60 years or older, the age range whose share of the population grew from 13.3% to 16.3%. The age-specific component changed sign with the endpoints, and was largest in the comparison ending in 2020, the year with the highest rates. For this reason we rely on the eight-year standardised trend as the main evidence and use the decomposition to describe where the crude increase comes from.</w:t>
+        <w:t xml:space="preserve">The Kitagawa decomposition gives this reading a quantitative form, but it is an accounting decomposition, not a causal one. It splits a difference between two years into a component due to the age distribution and a component due to age-specific rates; it does not identify why either changed. Because two-year comparisons depend on their endpoints, we repeated it for six pairs of years. The composition component was positive in all of them, and about 95% of it arose at 60 years or older, the age range whose share of the population grew from 13.3% to 16.3%. The age-specific component changed sign with the endpoints, and was largest in the comparison ending in 2020, the year with the highest rates. We therefore treat the eight-year standardised trend as the main evidence, with the decomposition describing contributions to the crude increase.</w:t>
       </w:r>
     </w:p>
     <w:p>
@@ -675,7 +675,7 @@
         <w:pStyle w:val="BodyText"/>
       </w:pPr>
       <w:r>
-        <w:t xml:space="preserve">The increase at 5–34 years needs a separate reading. The rate rose by about 20% between 2014 and 2021, and the estimate held with count models, with the WHO standard population and with the alternative projection. This age range was used in earlier Brazilian surveillance, in which Graudenz et al. reported a decline in age-standardised mortality from 1980 to 2014 [3]. Our primary estimate for this group is not standardised within the group, and the two studies differ in period and methods, so the comparison does not establish a change point in 2014. The finding rests on 172 to 236 deaths per year, and the highest rate occurred in 2020. It warrants monitoring with longer series rather than a firm conclusion about a reversal.</w:t>
+        <w:t xml:space="preserve">The increase at ages 5–34 requires separate interpretation. The rate rose by about 20% between 2014 and 2021, and the estimate held with count models, with the WHO standard population and with the alternative projection. This age range was used in earlier Brazilian surveillance, in which Graudenz et al. reported a decline in age-standardised mortality from 1980 to 2014 [3]. Our primary estimate for this group is not standardised within the group, and the two studies differ in period and methods, so the comparison does not establish a change point in 2014. The finding rests on 172 to 236 deaths per year, and the highest rate occurred in 2020. It warrants monitoring with longer series rather than a firm conclusion about a reversal.</w:t>
       </w:r>
     </w:p>
     <w:p>
@@ -683,7 +683,7 @@
         <w:pStyle w:val="BodyText"/>
       </w:pPr>
       <w:r>
-        <w:t xml:space="preserve">The reproduction also shows the limits of what published estimates allow. Our population denominators differed from those of the original study, so our annual national crude rates were 1.8% to 5.4% lower, and the magnitude of the change at 60 years or older could not be reconciled. The original code made it possible to identify these differences, but the exact population series could not be recovered. Reporting the denominators used, together with age-standardised rates alongside crude rates, would make national asthma surveillance comparable across studies and years.</w:t>
+        <w:t xml:space="preserve">The reproduction also revealed limits to exact comparison with published estimates. Our population denominators differed from those of the original study, so our annual national crude rates were 1.8% to 5.4% lower, and the magnitude of the change at 60 years or older could not be reconciled. The original code made it possible to identify these differences, but the exact population series could not be recovered. Reporting the denominators used, together with age-standardised rates alongside crude rates, would make national asthma surveillance comparable across studies and years.</w:t>
       </w:r>
     </w:p>
     <w:p>
@@ -691,7 +691,7 @@
         <w:pStyle w:val="BodyText"/>
       </w:pPr>
       <w:r>
-        <w:t xml:space="preserve">This study has further limitations. The design is ecological and descriptive. The count models, the WHO standard population, the alternative projection and the decomposition were added after the main analyses and should be read as robustness or descriptive analyses, and we made no adjustment for multiple comparisons. The SIM files may have been revised since the original analysis, our deduplication did not reproduce the original procedure exactly, and changes in death certification or coding during the period, including during the COVID-19 pandemic, cannot be excluded. The questions were defined in the project documentation, but we could not document their timing relative to the analyses independently.</w:t>
+        <w:t xml:space="preserve">Several limitations remain. The design is ecological and descriptive. The count models, the WHO standard population, the alternative projection and the decomposition were added after the main analyses and should be read as robustness or descriptive analyses, and we made no adjustment for multiple comparisons. The SIM files may have been revised since the original analysis, our deduplication did not reproduce the original procedure exactly, and changes in death certification or coding during the period, including during the COVID-19 pandemic, cannot be excluded. The questions were defined in the project documentation, but we could not document their timing relative to the analyses independently.</w:t>
       </w:r>
     </w:p>
     <w:p>
@@ -699,7 +699,7 @@
         <w:pStyle w:val="BodyText"/>
       </w:pPr>
       <w:r>
-        <w:t xml:space="preserve">In conclusion, the increase in crude asthma mortality in Brazil between 2014 and 2021 is reproducible, but it was not accompanied by a comparable increase in age-standardised mortality, and changes in population age structure accounted for most of it. Mortality at 5–34 years did increase over the period. National surveillance should report age-standardised and age-specific trends together with crude rates, because in this case they lead to different conclusions about the direction of asthma mortality.</w:t>
+        <w:t xml:space="preserve">Overall, the increase in crude asthma mortality in Brazil between 2014 and 2021 is reproducible, but it was not accompanied by a comparable increase in age-standardised mortality, and changes in population age structure accounted for most of it. Mortality at 5–34 years did increase over the period. National surveillance should report age-standardised and age-specific trends together with crude rates, because in this case they lead to different conclusions about the direction of asthma mortality.</w:t>
       </w:r>
     </w:p>
     <w:bookmarkEnd w:id="36"/>
@@ -717,7 +717,7 @@
         <w:pStyle w:val="FirstParagraph"/>
       </w:pPr>
       <w:r>
-        <w:t xml:space="preserve">[AUTHOR INPUT REQUIRED. If generative AI was used to draft or edit manuscript text, RRCP requires it to be acknowledged here, naming the tool and how it was used.]</w:t>
+        <w:t xml:space="preserve">Generative AI tools were used for language editing of the manuscript text; the authors reviewed every suggested change and take full responsibility for the content. [AUTHOR INPUT REQUIRED: name the tools and versions, state whether they were also used to draft text, and validate this statement.]</w:t>
       </w:r>
     </w:p>
     <w:bookmarkEnd w:id="37"/>
@@ -1630,7 +1630,7 @@
         <w:t xml:space="preserve"> </w:t>
       </w:r>
       <w:r>
-        <w:t xml:space="preserve">Kitagawa decomposition of the change in the crude rate, completed ages 7 years and older, for six pairs of years (post hoc analysis), Brazil. Black bars: age-composition component; hatched bars: age-specific-rate component. The two components sum to the change in the crude rate. Deaths per 100,000; population from the IBGE 2018 projection. Exact values in Supplementary Table S6. File: fig2_kitagawa_sensitivity.jpg.</w:t>
+        <w:t xml:space="preserve">Kitagawa decomposition of the change in the crude rate, completed ages 7 years and older, for six pairs of years (post hoc analysis), Brazil. Black bars: age-composition component; hatched bars: age-specific-rate component. The two components sum to the change in the crude rate. Deaths per 100,000; population from the IBGE 2018 projection. The components are accounting terms, not causal effects. Exact values in Supplementary Table S6. File: fig2_kitagawa_sensitivity.jpg.</w:t>
       </w:r>
     </w:p>
     <w:bookmarkEnd w:id="43"/>

</xml_diff>

<commit_message>
Regenerate all outputs with U07.1 in the COVID exclusion
Full re-run on this branch: run_pipeline.R (00-06, 10),
check_fase1_reconciliation.R, 07_denominator_sensitivity.R,
08_count_models_and_who_standard.R, 09_manuscript_assets.R,
build_review_figures.py, build_docx.sh, build_review_figures.py.
All scripts exited 0 with their internal checks. Manuscript sources
(manuscript.md, supplement.md, title_page.md) are unchanged.
Comparison with main: reanalysis/audit/u071_rerun_diff.md.

Co-Authored-By: Claude Opus 5.5 <noreply@anthropic.com>
Claude-Session: https://claude.ai/code/session_01Jjc2YuT424wLt15p5tkiYG
</commit_message>
<xml_diff>
--- a/reanalysis/manuscript/article/build/manuscript.docx
+++ b/reanalysis/manuscript/article/build/manuscript.docx
@@ -1115,19 +1115,19 @@
               <w:jc w:val="right"/>
             </w:pPr>
             <w:r>
-              <w:t xml:space="preserve">+12.5</w:t>
-            </w:r>
-          </w:p>
-        </w:tc>
-        <w:tc>
-          <w:tcPr/>
-          <w:p>
-            <w:pPr>
-              <w:pStyle w:val="Compact"/>
-              <w:jc w:val="right"/>
-            </w:pPr>
-            <w:r>
-              <w:t xml:space="preserve">0.0250</w:t>
+              <w:t xml:space="preserve">+12.4</w:t>
+            </w:r>
+          </w:p>
+        </w:tc>
+        <w:tc>
+          <w:tcPr/>
+          <w:p>
+            <w:pPr>
+              <w:pStyle w:val="Compact"/>
+              <w:jc w:val="right"/>
+            </w:pPr>
+            <w:r>
+              <w:t xml:space="preserve">0.0249</w:t>
             </w:r>
           </w:p>
         </w:tc>
@@ -1139,7 +1139,7 @@
               <w:jc w:val="left"/>
             </w:pPr>
             <w:r>
-              <w:t xml:space="preserve">(0.0036 to 0.0463)</w:t>
+              <w:t xml:space="preserve">(0.0035 to 0.0463)</w:t>
             </w:r>
           </w:p>
         </w:tc>
@@ -1237,7 +1237,7 @@
               <w:jc w:val="right"/>
             </w:pPr>
             <w:r>
-              <w:t xml:space="preserve">0.032</w:t>
+              <w:t xml:space="preserve">0.033</w:t>
             </w:r>
           </w:p>
         </w:tc>
@@ -1275,19 +1275,19 @@
               <w:jc w:val="right"/>
             </w:pPr>
             <w:r>
-              <w:t xml:space="preserve">1.078</w:t>
-            </w:r>
-          </w:p>
-        </w:tc>
-        <w:tc>
-          <w:tcPr/>
-          <w:p>
-            <w:pPr>
-              <w:pStyle w:val="Compact"/>
-              <w:jc w:val="right"/>
-            </w:pPr>
-            <w:r>
-              <w:t xml:space="preserve">−4.0</w:t>
+              <w:t xml:space="preserve">1.077</w:t>
+            </w:r>
+          </w:p>
+        </w:tc>
+        <w:tc>
+          <w:tcPr/>
+          <w:p>
+            <w:pPr>
+              <w:pStyle w:val="Compact"/>
+              <w:jc w:val="right"/>
+            </w:pPr>
+            <w:r>
+              <w:t xml:space="preserve">−4.1</w:t>
             </w:r>
           </w:p>
         </w:tc>
@@ -1311,19 +1311,19 @@
               <w:jc w:val="left"/>
             </w:pPr>
             <w:r>
-              <w:t xml:space="preserve">(−0.0213 to 0.0217)</w:t>
-            </w:r>
-          </w:p>
-        </w:tc>
-        <w:tc>
-          <w:tcPr/>
-          <w:p>
-            <w:pPr>
-              <w:pStyle w:val="Compact"/>
-              <w:jc w:val="right"/>
-            </w:pPr>
-            <w:r>
-              <w:t xml:space="preserve">0.983</w:t>
+              <w:t xml:space="preserve">(−0.0214 to 0.0217)</w:t>
+            </w:r>
+          </w:p>
+        </w:tc>
+        <w:tc>
+          <w:tcPr/>
+          <w:p>
+            <w:pPr>
+              <w:pStyle w:val="Compact"/>
+              <w:jc w:val="right"/>
+            </w:pPr>
+            <w:r>
+              <w:t xml:space="preserve">0.987</w:t>
             </w:r>
           </w:p>
         </w:tc>
@@ -1361,31 +1361,31 @@
               <w:jc w:val="right"/>
             </w:pPr>
             <w:r>
-              <w:t xml:space="preserve">0.219</w:t>
-            </w:r>
-          </w:p>
-        </w:tc>
-        <w:tc>
-          <w:tcPr/>
-          <w:p>
-            <w:pPr>
-              <w:pStyle w:val="Compact"/>
-              <w:jc w:val="right"/>
-            </w:pPr>
-            <w:r>
-              <w:t xml:space="preserve">+20.3</w:t>
-            </w:r>
-          </w:p>
-        </w:tc>
-        <w:tc>
-          <w:tcPr/>
-          <w:p>
-            <w:pPr>
-              <w:pStyle w:val="Compact"/>
-              <w:jc w:val="right"/>
-            </w:pPr>
-            <w:r>
-              <w:t xml:space="preserve">0.0080</w:t>
+              <w:t xml:space="preserve">0.218</w:t>
+            </w:r>
+          </w:p>
+        </w:tc>
+        <w:tc>
+          <w:tcPr/>
+          <w:p>
+            <w:pPr>
+              <w:pStyle w:val="Compact"/>
+              <w:jc w:val="right"/>
+            </w:pPr>
+            <w:r>
+              <w:t xml:space="preserve">+19.7</w:t>
+            </w:r>
+          </w:p>
+        </w:tc>
+        <w:tc>
+          <w:tcPr/>
+          <w:p>
+            <w:pPr>
+              <w:pStyle w:val="Compact"/>
+              <w:jc w:val="right"/>
+            </w:pPr>
+            <w:r>
+              <w:t xml:space="preserve">0.0079</w:t>
             </w:r>
           </w:p>
         </w:tc>
@@ -1397,19 +1397,19 @@
               <w:jc w:val="left"/>
             </w:pPr>
             <w:r>
-              <w:t xml:space="preserve">(0.0023 to 0.0138)</w:t>
-            </w:r>
-          </w:p>
-        </w:tc>
-        <w:tc>
-          <w:tcPr/>
-          <w:p>
-            <w:pPr>
-              <w:pStyle w:val="Compact"/>
-              <w:jc w:val="right"/>
-            </w:pPr>
-            <w:r>
-              <w:t xml:space="preserve">0.014</w:t>
+              <w:t xml:space="preserve">(0.0021 to 0.0138)</w:t>
+            </w:r>
+          </w:p>
+        </w:tc>
+        <w:tc>
+          <w:tcPr/>
+          <w:p>
+            <w:pPr>
+              <w:pStyle w:val="Compact"/>
+              <w:jc w:val="right"/>
+            </w:pPr>
+            <w:r>
+              <w:t xml:space="preserve">0.016</w:t>
             </w:r>
           </w:p>
         </w:tc>
@@ -1447,31 +1447,31 @@
               <w:jc w:val="right"/>
             </w:pPr>
             <w:r>
-              <w:t xml:space="preserve">0.224</w:t>
-            </w:r>
-          </w:p>
-        </w:tc>
-        <w:tc>
-          <w:tcPr/>
-          <w:p>
-            <w:pPr>
-              <w:pStyle w:val="Compact"/>
-              <w:jc w:val="right"/>
-            </w:pPr>
-            <w:r>
-              <w:t xml:space="preserve">+23.5</w:t>
-            </w:r>
-          </w:p>
-        </w:tc>
-        <w:tc>
-          <w:tcPr/>
-          <w:p>
-            <w:pPr>
-              <w:pStyle w:val="Compact"/>
-              <w:jc w:val="right"/>
-            </w:pPr>
-            <w:r>
-              <w:t xml:space="preserve">0.0094</w:t>
+              <w:t xml:space="preserve">0.223</w:t>
+            </w:r>
+          </w:p>
+        </w:tc>
+        <w:tc>
+          <w:tcPr/>
+          <w:p>
+            <w:pPr>
+              <w:pStyle w:val="Compact"/>
+              <w:jc w:val="right"/>
+            </w:pPr>
+            <w:r>
+              <w:t xml:space="preserve">+22.9</w:t>
+            </w:r>
+          </w:p>
+        </w:tc>
+        <w:tc>
+          <w:tcPr/>
+          <w:p>
+            <w:pPr>
+              <w:pStyle w:val="Compact"/>
+              <w:jc w:val="right"/>
+            </w:pPr>
+            <w:r>
+              <w:t xml:space="preserve">0.0093</w:t>
             </w:r>
           </w:p>
         </w:tc>
@@ -1483,19 +1483,19 @@
               <w:jc w:val="left"/>
             </w:pPr>
             <w:r>
-              <w:t xml:space="preserve">(0.0031 to 0.0156)</w:t>
-            </w:r>
-          </w:p>
-        </w:tc>
-        <w:tc>
-          <w:tcPr/>
-          <w:p>
-            <w:pPr>
-              <w:pStyle w:val="Compact"/>
-              <w:jc w:val="right"/>
-            </w:pPr>
-            <w:r>
-              <w:t xml:space="preserve">0.011</w:t>
+              <w:t xml:space="preserve">(0.0029 to 0.0156)</w:t>
+            </w:r>
+          </w:p>
+        </w:tc>
+        <w:tc>
+          <w:tcPr/>
+          <w:p>
+            <w:pPr>
+              <w:pStyle w:val="Compact"/>
+              <w:jc w:val="right"/>
+            </w:pPr>
+            <w:r>
+              <w:t xml:space="preserve">0.012</w:t>
             </w:r>
           </w:p>
         </w:tc>

</xml_diff>